<commit_message>
12-13_18:03, td_pc, thêm thủ lăng nghiêm
</commit_message>
<xml_diff>
--- a/chu lang nghiem viet.docx
+++ b/chu lang nghiem viet.docx
@@ -7,8 +7,524 @@
         <w:pStyle w:val="Heading1"/>
       </w:pPr>
       <w:r>
-        <w:t>Khai kinh kệ</w:t>
-      </w:r>
+        <w:t xml:space="preserve">Tán Phật </w:t>
+      </w:r>
+    </w:p>
+    <w:p>
+      <w:pPr>
+        <w:shd w:val="clear" w:color="auto" w:fill="FFFFFF"/>
+        <w:rPr>
+          <w:rFonts w:ascii="inherit" w:hAnsi="inherit" w:cs="Arial"/>
+          <w:b w:val="0"/>
+          <w:color w:val="050505"/>
+          <w:sz w:val="23"/>
+          <w:szCs w:val="23"/>
+          <w:lang w:eastAsia="zh-CN"/>
+        </w:rPr>
+      </w:pPr>
+      <w:r>
+        <w:rPr>
+          <w:rFonts w:ascii="inherit" w:hAnsi="inherit" w:cs="Arial"/>
+          <w:b w:val="0"/>
+          <w:color w:val="050505"/>
+          <w:sz w:val="23"/>
+          <w:szCs w:val="23"/>
+          <w:lang w:eastAsia="zh-CN"/>
+        </w:rPr>
+        <w:t xml:space="preserve">Pháp vương vô thượng tôn, </w:t>
+      </w:r>
+    </w:p>
+    <w:p>
+      <w:pPr>
+        <w:shd w:val="clear" w:color="auto" w:fill="FFFFFF"/>
+        <w:rPr>
+          <w:rFonts w:ascii="inherit" w:hAnsi="inherit" w:cs="Arial"/>
+          <w:b w:val="0"/>
+          <w:color w:val="050505"/>
+          <w:sz w:val="23"/>
+          <w:szCs w:val="23"/>
+          <w:lang w:eastAsia="zh-CN"/>
+        </w:rPr>
+      </w:pPr>
+      <w:r>
+        <w:rPr>
+          <w:rFonts w:ascii="inherit" w:hAnsi="inherit" w:cs="Arial"/>
+          <w:b w:val="0"/>
+          <w:color w:val="050505"/>
+          <w:sz w:val="23"/>
+          <w:szCs w:val="23"/>
+          <w:lang w:eastAsia="zh-CN"/>
+        </w:rPr>
+        <w:t xml:space="preserve">Tam giới vô luân thất, </w:t>
+      </w:r>
+    </w:p>
+    <w:p>
+      <w:pPr>
+        <w:shd w:val="clear" w:color="auto" w:fill="FFFFFF"/>
+        <w:rPr>
+          <w:rFonts w:ascii="inherit" w:hAnsi="inherit" w:cs="Arial"/>
+          <w:b w:val="0"/>
+          <w:color w:val="050505"/>
+          <w:sz w:val="23"/>
+          <w:szCs w:val="23"/>
+          <w:lang w:eastAsia="zh-CN"/>
+        </w:rPr>
+      </w:pPr>
+      <w:r>
+        <w:rPr>
+          <w:rFonts w:ascii="inherit" w:hAnsi="inherit" w:cs="Arial"/>
+          <w:b w:val="0"/>
+          <w:color w:val="050505"/>
+          <w:sz w:val="23"/>
+          <w:szCs w:val="23"/>
+          <w:lang w:eastAsia="zh-CN"/>
+        </w:rPr>
+        <w:t xml:space="preserve">Thiên nhơn chi Đạo sư, </w:t>
+      </w:r>
+    </w:p>
+    <w:p>
+      <w:pPr>
+        <w:shd w:val="clear" w:color="auto" w:fill="FFFFFF"/>
+        <w:rPr>
+          <w:rFonts w:ascii="inherit" w:hAnsi="inherit" w:cs="Arial"/>
+          <w:b w:val="0"/>
+          <w:color w:val="050505"/>
+          <w:sz w:val="23"/>
+          <w:szCs w:val="23"/>
+          <w:lang w:eastAsia="zh-CN"/>
+        </w:rPr>
+      </w:pPr>
+      <w:r>
+        <w:rPr>
+          <w:rFonts w:ascii="inherit" w:hAnsi="inherit" w:cs="Arial"/>
+          <w:b w:val="0"/>
+          <w:color w:val="050505"/>
+          <w:sz w:val="23"/>
+          <w:szCs w:val="23"/>
+          <w:lang w:eastAsia="zh-CN"/>
+        </w:rPr>
+        <w:t xml:space="preserve">Tứ sinh chi Từ phụ, </w:t>
+      </w:r>
+    </w:p>
+    <w:p>
+      <w:pPr>
+        <w:shd w:val="clear" w:color="auto" w:fill="FFFFFF"/>
+        <w:rPr>
+          <w:rFonts w:ascii="inherit" w:hAnsi="inherit" w:cs="Arial"/>
+          <w:b w:val="0"/>
+          <w:color w:val="050505"/>
+          <w:sz w:val="23"/>
+          <w:szCs w:val="23"/>
+          <w:lang w:eastAsia="zh-CN"/>
+        </w:rPr>
+      </w:pPr>
+      <w:r>
+        <w:rPr>
+          <w:rFonts w:ascii="inherit" w:hAnsi="inherit" w:cs="Arial"/>
+          <w:b w:val="0"/>
+          <w:color w:val="050505"/>
+          <w:sz w:val="23"/>
+          <w:szCs w:val="23"/>
+          <w:lang w:eastAsia="zh-CN"/>
+        </w:rPr>
+        <w:t xml:space="preserve">Ư nhứt niệm quy y, </w:t>
+      </w:r>
+    </w:p>
+    <w:p>
+      <w:pPr>
+        <w:shd w:val="clear" w:color="auto" w:fill="FFFFFF"/>
+        <w:rPr>
+          <w:rFonts w:ascii="inherit" w:hAnsi="inherit" w:cs="Arial"/>
+          <w:b w:val="0"/>
+          <w:color w:val="050505"/>
+          <w:sz w:val="23"/>
+          <w:szCs w:val="23"/>
+          <w:lang w:eastAsia="zh-CN"/>
+        </w:rPr>
+      </w:pPr>
+      <w:r>
+        <w:rPr>
+          <w:rFonts w:ascii="inherit" w:hAnsi="inherit" w:cs="Arial"/>
+          <w:b w:val="0"/>
+          <w:color w:val="050505"/>
+          <w:sz w:val="23"/>
+          <w:szCs w:val="23"/>
+          <w:lang w:eastAsia="zh-CN"/>
+        </w:rPr>
+        <w:t xml:space="preserve">Năng diệt tam kỳ nghiệp, </w:t>
+      </w:r>
+    </w:p>
+    <w:p>
+      <w:pPr>
+        <w:shd w:val="clear" w:color="auto" w:fill="FFFFFF"/>
+        <w:rPr>
+          <w:rFonts w:ascii="inherit" w:hAnsi="inherit" w:cs="Arial"/>
+          <w:b w:val="0"/>
+          <w:color w:val="050505"/>
+          <w:sz w:val="23"/>
+          <w:szCs w:val="23"/>
+          <w:lang w:eastAsia="zh-CN"/>
+        </w:rPr>
+      </w:pPr>
+      <w:r>
+        <w:rPr>
+          <w:rFonts w:ascii="inherit" w:hAnsi="inherit" w:cs="Arial"/>
+          <w:b w:val="0"/>
+          <w:color w:val="050505"/>
+          <w:sz w:val="23"/>
+          <w:szCs w:val="23"/>
+          <w:lang w:eastAsia="zh-CN"/>
+        </w:rPr>
+        <w:t xml:space="preserve">Xưng dương nhược tán thán, </w:t>
+      </w:r>
+    </w:p>
+    <w:p>
+      <w:pPr>
+        <w:shd w:val="clear" w:color="auto" w:fill="FFFFFF"/>
+        <w:rPr>
+          <w:rFonts w:ascii="inherit" w:hAnsi="inherit" w:cs="Arial"/>
+          <w:b w:val="0"/>
+          <w:color w:val="050505"/>
+          <w:sz w:val="23"/>
+          <w:szCs w:val="23"/>
+          <w:lang w:eastAsia="zh-CN"/>
+        </w:rPr>
+      </w:pPr>
+      <w:r>
+        <w:rPr>
+          <w:rFonts w:ascii="inherit" w:hAnsi="inherit" w:cs="Arial"/>
+          <w:b w:val="0"/>
+          <w:color w:val="050505"/>
+          <w:sz w:val="23"/>
+          <w:szCs w:val="23"/>
+          <w:lang w:eastAsia="zh-CN"/>
+        </w:rPr>
+        <w:t>Ức kiếp mạc năng tận.</w:t>
+      </w:r>
+    </w:p>
+    <w:p>
+      <w:pPr>
+        <w:pStyle w:val="Heading1"/>
+      </w:pPr>
+      <w:r>
+        <w:t>Quán Tưởng</w:t>
+      </w:r>
+      <w:r>
+        <w:tab/>
+      </w:r>
+    </w:p>
+    <w:p>
+      <w:pPr>
+        <w:shd w:val="clear" w:color="auto" w:fill="FFFFFF"/>
+        <w:rPr>
+          <w:rFonts w:ascii="inherit" w:hAnsi="inherit" w:cs="Arial"/>
+          <w:b w:val="0"/>
+          <w:color w:val="050505"/>
+          <w:sz w:val="23"/>
+          <w:szCs w:val="23"/>
+          <w:lang w:eastAsia="zh-CN"/>
+        </w:rPr>
+      </w:pPr>
+      <w:r>
+        <w:rPr>
+          <w:rFonts w:ascii="inherit" w:hAnsi="inherit" w:cs="Arial"/>
+          <w:b w:val="0"/>
+          <w:color w:val="050505"/>
+          <w:sz w:val="23"/>
+          <w:szCs w:val="23"/>
+          <w:lang w:eastAsia="zh-CN"/>
+        </w:rPr>
+        <w:t>Năng lễ, sở lễ, tánh không tịch,</w:t>
+      </w:r>
+    </w:p>
+    <w:p>
+      <w:pPr>
+        <w:shd w:val="clear" w:color="auto" w:fill="FFFFFF"/>
+        <w:rPr>
+          <w:rFonts w:ascii="inherit" w:hAnsi="inherit" w:cs="Arial"/>
+          <w:b w:val="0"/>
+          <w:color w:val="050505"/>
+          <w:sz w:val="23"/>
+          <w:szCs w:val="23"/>
+          <w:lang w:eastAsia="zh-CN"/>
+        </w:rPr>
+      </w:pPr>
+      <w:r>
+        <w:rPr>
+          <w:rFonts w:ascii="inherit" w:hAnsi="inherit" w:cs="Arial"/>
+          <w:b w:val="0"/>
+          <w:color w:val="050505"/>
+          <w:sz w:val="23"/>
+          <w:szCs w:val="23"/>
+          <w:lang w:eastAsia="zh-CN"/>
+        </w:rPr>
+        <w:t>Cảm ứng đạo giao nan tư nghị.</w:t>
+      </w:r>
+    </w:p>
+    <w:p>
+      <w:pPr>
+        <w:shd w:val="clear" w:color="auto" w:fill="FFFFFF"/>
+        <w:rPr>
+          <w:rFonts w:ascii="inherit" w:hAnsi="inherit" w:cs="Arial"/>
+          <w:b w:val="0"/>
+          <w:color w:val="050505"/>
+          <w:sz w:val="23"/>
+          <w:szCs w:val="23"/>
+          <w:lang w:eastAsia="zh-CN"/>
+        </w:rPr>
+      </w:pPr>
+      <w:r>
+        <w:rPr>
+          <w:rFonts w:ascii="inherit" w:hAnsi="inherit" w:cs="Arial"/>
+          <w:b w:val="0"/>
+          <w:color w:val="050505"/>
+          <w:sz w:val="23"/>
+          <w:szCs w:val="23"/>
+          <w:lang w:eastAsia="zh-CN"/>
+        </w:rPr>
+        <w:t>Ngã thử đạo tràng như đế châu,</w:t>
+      </w:r>
+    </w:p>
+    <w:p>
+      <w:pPr>
+        <w:shd w:val="clear" w:color="auto" w:fill="FFFFFF"/>
+        <w:rPr>
+          <w:rFonts w:ascii="inherit" w:hAnsi="inherit" w:cs="Arial"/>
+          <w:b w:val="0"/>
+          <w:color w:val="050505"/>
+          <w:sz w:val="23"/>
+          <w:szCs w:val="23"/>
+          <w:lang w:eastAsia="zh-CN"/>
+        </w:rPr>
+      </w:pPr>
+      <w:r>
+        <w:rPr>
+          <w:rFonts w:ascii="inherit" w:hAnsi="inherit" w:cs="Arial"/>
+          <w:b w:val="0"/>
+          <w:color w:val="050505"/>
+          <w:sz w:val="23"/>
+          <w:szCs w:val="23"/>
+          <w:lang w:eastAsia="zh-CN"/>
+        </w:rPr>
+        <w:t>Thập phương chư Phật ảnh hiện trung.</w:t>
+      </w:r>
+    </w:p>
+    <w:p>
+      <w:pPr>
+        <w:shd w:val="clear" w:color="auto" w:fill="FFFFFF"/>
+        <w:rPr>
+          <w:rFonts w:ascii="inherit" w:hAnsi="inherit" w:cs="Arial"/>
+          <w:b w:val="0"/>
+          <w:color w:val="050505"/>
+          <w:sz w:val="23"/>
+          <w:szCs w:val="23"/>
+          <w:lang w:eastAsia="zh-CN"/>
+        </w:rPr>
+      </w:pPr>
+      <w:r>
+        <w:rPr>
+          <w:rFonts w:ascii="inherit" w:hAnsi="inherit" w:cs="Arial"/>
+          <w:b w:val="0"/>
+          <w:color w:val="050505"/>
+          <w:sz w:val="23"/>
+          <w:szCs w:val="23"/>
+          <w:lang w:eastAsia="zh-CN"/>
+        </w:rPr>
+        <w:t>Ngã thân ảnh hiện chư Phật tiền,</w:t>
+      </w:r>
+    </w:p>
+    <w:p>
+      <w:pPr>
+        <w:shd w:val="clear" w:color="auto" w:fill="FFFFFF"/>
+        <w:rPr>
+          <w:rFonts w:ascii="inherit" w:hAnsi="inherit" w:cs="Arial"/>
+          <w:b w:val="0"/>
+          <w:color w:val="050505"/>
+          <w:sz w:val="23"/>
+          <w:szCs w:val="23"/>
+          <w:lang w:eastAsia="zh-CN"/>
+        </w:rPr>
+      </w:pPr>
+      <w:r>
+        <w:rPr>
+          <w:rFonts w:ascii="inherit" w:hAnsi="inherit" w:cs="Arial"/>
+          <w:b w:val="0"/>
+          <w:color w:val="050505"/>
+          <w:sz w:val="23"/>
+          <w:szCs w:val="23"/>
+          <w:lang w:eastAsia="zh-CN"/>
+        </w:rPr>
+        <w:t>Đầu diện tiếp túc qui mạng lễ.</w:t>
+      </w:r>
+    </w:p>
+    <w:p>
+      <w:pPr>
+        <w:shd w:val="clear" w:color="auto" w:fill="FFFFFF"/>
+        <w:rPr>
+          <w:rFonts w:ascii="inherit" w:hAnsi="inherit" w:cs="Arial"/>
+          <w:b w:val="0"/>
+          <w:color w:val="050505"/>
+          <w:sz w:val="23"/>
+          <w:szCs w:val="23"/>
+          <w:lang w:eastAsia="zh-CN"/>
+        </w:rPr>
+      </w:pPr>
+    </w:p>
+    <w:p>
+      <w:pPr>
+        <w:pStyle w:val="Heading1"/>
+      </w:pPr>
+      <w:r>
+        <w:t>Đảnh Lễ</w:t>
+      </w:r>
+    </w:p>
+    <w:p>
+      <w:pPr>
+        <w:shd w:val="clear" w:color="auto" w:fill="FFFFFF"/>
+        <w:rPr>
+          <w:rFonts w:ascii="inherit" w:hAnsi="inherit" w:cs="Arial"/>
+          <w:b w:val="0"/>
+          <w:color w:val="050505"/>
+          <w:sz w:val="23"/>
+          <w:szCs w:val="23"/>
+          <w:lang w:eastAsia="zh-CN"/>
+        </w:rPr>
+      </w:pPr>
+      <w:r>
+        <w:rPr>
+          <w:rFonts w:ascii="inherit" w:hAnsi="inherit" w:cs="Arial"/>
+          <w:b w:val="0"/>
+          <w:color w:val="050505"/>
+          <w:sz w:val="23"/>
+          <w:szCs w:val="23"/>
+          <w:lang w:eastAsia="zh-CN"/>
+        </w:rPr>
+        <w:t>Chí tâm đảnh lễ: Nam mô tận hư không biến pháp giới quá hiện vị lai Mười phương chư Phật, Tôn Pháp Hiền Thánh Tăng thường trụ Tam Bảo. (1 lạy)</w:t>
+      </w:r>
+    </w:p>
+    <w:p>
+      <w:pPr>
+        <w:shd w:val="clear" w:color="auto" w:fill="FFFFFF"/>
+        <w:rPr>
+          <w:rFonts w:ascii="inherit" w:hAnsi="inherit" w:cs="Arial"/>
+          <w:b w:val="0"/>
+          <w:color w:val="050505"/>
+          <w:sz w:val="23"/>
+          <w:szCs w:val="23"/>
+          <w:lang w:eastAsia="zh-CN"/>
+        </w:rPr>
+      </w:pPr>
+    </w:p>
+    <w:p>
+      <w:pPr>
+        <w:shd w:val="clear" w:color="auto" w:fill="FFFFFF"/>
+        <w:rPr>
+          <w:rFonts w:ascii="inherit" w:hAnsi="inherit" w:cs="Arial"/>
+          <w:b w:val="0"/>
+          <w:color w:val="050505"/>
+          <w:sz w:val="23"/>
+          <w:szCs w:val="23"/>
+          <w:lang w:eastAsia="zh-CN"/>
+        </w:rPr>
+      </w:pPr>
+      <w:r>
+        <w:rPr>
+          <w:rFonts w:ascii="inherit" w:hAnsi="inherit" w:cs="Arial"/>
+          <w:b w:val="0"/>
+          <w:color w:val="050505"/>
+          <w:sz w:val="23"/>
+          <w:szCs w:val="23"/>
+          <w:lang w:eastAsia="zh-CN"/>
+        </w:rPr>
+        <w:t>Chí tâm đảnh lễ: Nam mô Ta Bà Giáo Chủ Điều Ngự Bổn Sư Thích Ca Mâu Ni Phật, Đương Lai Hạ Sanh Di Lặc Tôn Phật, Đại Trí Văn Thù Sư Lợi Bồ Tát, Đại Hạnh Phổ Hiền Bồ Tát, Hộ Pháp Chư Tôn Bồ Tát, Linh Sơn Hội Thượng Phật Bồ Tát. (1 lạy)</w:t>
+      </w:r>
+    </w:p>
+    <w:p>
+      <w:pPr>
+        <w:shd w:val="clear" w:color="auto" w:fill="FFFFFF"/>
+        <w:rPr>
+          <w:rFonts w:ascii="inherit" w:hAnsi="inherit" w:cs="Arial"/>
+          <w:b w:val="0"/>
+          <w:color w:val="050505"/>
+          <w:sz w:val="23"/>
+          <w:szCs w:val="23"/>
+          <w:lang w:eastAsia="zh-CN"/>
+        </w:rPr>
+      </w:pPr>
+    </w:p>
+    <w:p>
+      <w:pPr>
+        <w:shd w:val="clear" w:color="auto" w:fill="FFFFFF"/>
+        <w:rPr>
+          <w:rFonts w:ascii="inherit" w:hAnsi="inherit" w:cs="Arial"/>
+          <w:b w:val="0"/>
+          <w:color w:val="050505"/>
+          <w:sz w:val="23"/>
+          <w:szCs w:val="23"/>
+          <w:lang w:eastAsia="zh-CN"/>
+        </w:rPr>
+      </w:pPr>
+      <w:r>
+        <w:rPr>
+          <w:rFonts w:ascii="inherit" w:hAnsi="inherit" w:cs="Arial"/>
+          <w:b w:val="0"/>
+          <w:color w:val="050505"/>
+          <w:sz w:val="23"/>
+          <w:szCs w:val="23"/>
+          <w:lang w:eastAsia="zh-CN"/>
+        </w:rPr>
+        <w:t xml:space="preserve">Chí tâm đảnh lễ: Nam mô Tây Phương Cực Lạc Thế Giới Đại Từ Đại Bi A Di Đà Phật, Đại Bi Quán Thế Âm Bồ Tát, Đại Thế Chí Bồ Tát, Đại Nguyện Địa Tạng Vương Bồ Tát, Thanh Tịnh </w:t>
+      </w:r>
+    </w:p>
+    <w:p>
+      <w:pPr>
+        <w:shd w:val="clear" w:color="auto" w:fill="FFFFFF"/>
+        <w:rPr>
+          <w:rFonts w:ascii="inherit" w:hAnsi="inherit" w:cs="Arial"/>
+          <w:b w:val="0"/>
+          <w:color w:val="050505"/>
+          <w:sz w:val="23"/>
+          <w:szCs w:val="23"/>
+          <w:lang w:eastAsia="zh-CN"/>
+        </w:rPr>
+      </w:pPr>
+    </w:p>
+    <w:p>
+      <w:pPr>
+        <w:shd w:val="clear" w:color="auto" w:fill="FFFFFF"/>
+        <w:rPr>
+          <w:rFonts w:ascii="inherit" w:hAnsi="inherit" w:cs="Arial"/>
+          <w:b w:val="0"/>
+          <w:color w:val="050505"/>
+          <w:sz w:val="23"/>
+          <w:szCs w:val="23"/>
+          <w:lang w:eastAsia="zh-CN"/>
+        </w:rPr>
+      </w:pPr>
+      <w:r>
+        <w:rPr>
+          <w:rFonts w:ascii="inherit" w:hAnsi="inherit" w:cs="Arial"/>
+          <w:b w:val="0"/>
+          <w:color w:val="050505"/>
+          <w:sz w:val="23"/>
+          <w:szCs w:val="23"/>
+          <w:lang w:eastAsia="zh-CN"/>
+        </w:rPr>
+        <w:t>Nam Mô Lăng Nghiêm Hội Thượng Phật Bồ Tát (3 lần)</w:t>
+      </w:r>
+    </w:p>
+    <w:p>
+      <w:pPr>
+        <w:shd w:val="clear" w:color="auto" w:fill="FFFFFF"/>
+        <w:rPr>
+          <w:rFonts w:ascii="inherit" w:hAnsi="inherit" w:cs="Arial"/>
+          <w:b w:val="0"/>
+          <w:color w:val="050505"/>
+          <w:sz w:val="23"/>
+          <w:szCs w:val="23"/>
+          <w:lang w:eastAsia="zh-CN"/>
+        </w:rPr>
+      </w:pPr>
     </w:p>
     <w:p>
       <w:pPr>
@@ -319,7 +835,7 @@
           <w:szCs w:val="23"/>
           <w:lang w:eastAsia="zh-CN"/>
         </w:rPr>
-        <w:t>Đại –hùng đại -lực đại -từ-bi,</w:t>
+        <w:t>Đại–hùng đại-lực đại-từ-bi,</w:t>
       </w:r>
     </w:p>
     <w:p>
@@ -367,31 +883,31 @@
           <w:szCs w:val="23"/>
           <w:lang w:eastAsia="zh-CN"/>
         </w:rPr>
-        <w:t>Linh ngã tảo đăng vô -thượng giác,</w:t>
-      </w:r>
-    </w:p>
-    <w:p>
-      <w:pPr>
-        <w:shd w:val="clear" w:color="auto" w:fill="FFFFFF"/>
-        <w:rPr>
-          <w:rFonts w:ascii="inherit" w:hAnsi="inherit" w:cs="Arial"/>
-          <w:b w:val="0"/>
-          <w:color w:val="050505"/>
-          <w:sz w:val="23"/>
-          <w:szCs w:val="23"/>
-          <w:lang w:eastAsia="zh-CN"/>
-        </w:rPr>
-      </w:pPr>
-      <w:r>
-        <w:rPr>
-          <w:rFonts w:ascii="inherit" w:hAnsi="inherit" w:cs="Arial"/>
-          <w:b w:val="0"/>
-          <w:color w:val="050505"/>
-          <w:sz w:val="23"/>
-          <w:szCs w:val="23"/>
-          <w:lang w:eastAsia="zh-CN"/>
-        </w:rPr>
-        <w:t>Ư thập phương giới tọa đạo tràng ;</w:t>
+        <w:t>Linh ngã tảo đăng vô-thượng giác,</w:t>
+      </w:r>
+    </w:p>
+    <w:p>
+      <w:pPr>
+        <w:shd w:val="clear" w:color="auto" w:fill="FFFFFF"/>
+        <w:rPr>
+          <w:rFonts w:ascii="inherit" w:hAnsi="inherit" w:cs="Arial"/>
+          <w:b w:val="0"/>
+          <w:color w:val="050505"/>
+          <w:sz w:val="23"/>
+          <w:szCs w:val="23"/>
+          <w:lang w:eastAsia="zh-CN"/>
+        </w:rPr>
+      </w:pPr>
+      <w:r>
+        <w:rPr>
+          <w:rFonts w:ascii="inherit" w:hAnsi="inherit" w:cs="Arial"/>
+          <w:b w:val="0"/>
+          <w:color w:val="050505"/>
+          <w:sz w:val="23"/>
+          <w:szCs w:val="23"/>
+          <w:lang w:eastAsia="zh-CN"/>
+        </w:rPr>
+        <w:t>Ư thập phương giới tọa đạo tràng;</w:t>
       </w:r>
     </w:p>
     <w:p>
@@ -439,8 +955,21 @@
           <w:szCs w:val="23"/>
           <w:lang w:eastAsia="zh-CN"/>
         </w:rPr>
-        <w:t>Thước –ca –ra tâm vô động chuyển.</w:t>
-      </w:r>
+        <w:t>Thước–ca–ra tâm vô động chuyển.</w:t>
+      </w:r>
+    </w:p>
+    <w:p>
+      <w:pPr>
+        <w:shd w:val="clear" w:color="auto" w:fill="FFFFFF"/>
+        <w:rPr>
+          <w:rFonts w:ascii="inherit" w:hAnsi="inherit" w:cs="Arial"/>
+          <w:b w:val="0"/>
+          <w:color w:val="050505"/>
+          <w:sz w:val="23"/>
+          <w:szCs w:val="23"/>
+          <w:lang w:eastAsia="zh-CN"/>
+        </w:rPr>
+      </w:pPr>
     </w:p>
     <w:p>
       <w:pPr>
@@ -622,6 +1151,19 @@
           <w:lang w:eastAsia="zh-CN"/>
         </w:rPr>
       </w:pPr>
+    </w:p>
+    <w:p>
+      <w:pPr>
+        <w:shd w:val="clear" w:color="auto" w:fill="FFFFFF"/>
+        <w:rPr>
+          <w:rFonts w:ascii="inherit" w:hAnsi="inherit" w:cs="Arial"/>
+          <w:b w:val="0"/>
+          <w:color w:val="050505"/>
+          <w:sz w:val="23"/>
+          <w:szCs w:val="23"/>
+          <w:lang w:eastAsia="zh-CN"/>
+        </w:rPr>
+      </w:pPr>
       <w:r>
         <w:rPr>
           <w:rFonts w:ascii="inherit" w:hAnsi="inherit" w:cs="Arial"/>
@@ -633,515 +1175,258 @@
         </w:rPr>
         <w:t>Nhĩ thời Thế-Tôn,</w:t>
       </w:r>
-    </w:p>
-    <w:p>
-      <w:pPr>
-        <w:shd w:val="clear" w:color="auto" w:fill="FFFFFF"/>
-        <w:rPr>
-          <w:rFonts w:ascii="inherit" w:hAnsi="inherit" w:cs="Arial"/>
-          <w:b w:val="0"/>
-          <w:color w:val="050505"/>
-          <w:sz w:val="23"/>
-          <w:szCs w:val="23"/>
-          <w:lang w:eastAsia="zh-CN"/>
-        </w:rPr>
-      </w:pPr>
-      <w:r>
-        <w:rPr>
-          <w:rFonts w:ascii="inherit" w:hAnsi="inherit" w:cs="Arial"/>
-          <w:b w:val="0"/>
-          <w:color w:val="050505"/>
-          <w:sz w:val="23"/>
-          <w:szCs w:val="23"/>
-          <w:lang w:eastAsia="zh-CN"/>
-        </w:rPr>
+      <w:r>
+        <w:rPr>
+          <w:rFonts w:ascii="inherit" w:hAnsi="inherit" w:cs="Arial"/>
+          <w:b w:val="0"/>
+          <w:color w:val="050505"/>
+          <w:sz w:val="23"/>
+          <w:szCs w:val="23"/>
+          <w:lang w:eastAsia="zh-CN"/>
+        </w:rPr>
+        <w:br/>
         <w:t>Tùng nhục-kế trung,</w:t>
       </w:r>
-    </w:p>
-    <w:p>
-      <w:pPr>
-        <w:shd w:val="clear" w:color="auto" w:fill="FFFFFF"/>
-        <w:rPr>
-          <w:rFonts w:ascii="inherit" w:hAnsi="inherit" w:cs="Arial"/>
-          <w:b w:val="0"/>
-          <w:color w:val="050505"/>
-          <w:sz w:val="23"/>
-          <w:szCs w:val="23"/>
-          <w:lang w:eastAsia="zh-CN"/>
-        </w:rPr>
-      </w:pPr>
-      <w:r>
-        <w:rPr>
-          <w:rFonts w:ascii="inherit" w:hAnsi="inherit" w:cs="Arial"/>
-          <w:b w:val="0"/>
-          <w:color w:val="050505"/>
-          <w:sz w:val="23"/>
-          <w:szCs w:val="23"/>
-          <w:lang w:eastAsia="zh-CN"/>
-        </w:rPr>
+      <w:r>
+        <w:rPr>
+          <w:rFonts w:ascii="inherit" w:hAnsi="inherit" w:cs="Arial"/>
+          <w:b w:val="0"/>
+          <w:color w:val="050505"/>
+          <w:sz w:val="23"/>
+          <w:szCs w:val="23"/>
+          <w:lang w:eastAsia="zh-CN"/>
+        </w:rPr>
+        <w:br/>
         <w:t>Dõng bá bảo-quang,</w:t>
       </w:r>
-    </w:p>
-    <w:p>
-      <w:pPr>
-        <w:shd w:val="clear" w:color="auto" w:fill="FFFFFF"/>
-        <w:rPr>
-          <w:rFonts w:ascii="inherit" w:hAnsi="inherit" w:cs="Arial"/>
-          <w:b w:val="0"/>
-          <w:color w:val="050505"/>
-          <w:sz w:val="23"/>
-          <w:szCs w:val="23"/>
-          <w:lang w:eastAsia="zh-CN"/>
-        </w:rPr>
-      </w:pPr>
-      <w:r>
-        <w:rPr>
-          <w:rFonts w:ascii="inherit" w:hAnsi="inherit" w:cs="Arial"/>
-          <w:b w:val="0"/>
-          <w:color w:val="050505"/>
-          <w:sz w:val="23"/>
-          <w:szCs w:val="23"/>
-          <w:lang w:eastAsia="zh-CN"/>
-        </w:rPr>
-        <w:t>Quang trung dõng xuất ,</w:t>
-      </w:r>
-    </w:p>
-    <w:p>
-      <w:pPr>
-        <w:shd w:val="clear" w:color="auto" w:fill="FFFFFF"/>
-        <w:rPr>
-          <w:rFonts w:ascii="inherit" w:hAnsi="inherit" w:cs="Arial"/>
-          <w:b w:val="0"/>
-          <w:color w:val="050505"/>
-          <w:sz w:val="23"/>
-          <w:szCs w:val="23"/>
-          <w:lang w:eastAsia="zh-CN"/>
-        </w:rPr>
-      </w:pPr>
-      <w:r>
-        <w:rPr>
-          <w:rFonts w:ascii="inherit" w:hAnsi="inherit" w:cs="Arial"/>
-          <w:b w:val="0"/>
-          <w:color w:val="050505"/>
-          <w:sz w:val="23"/>
-          <w:szCs w:val="23"/>
-          <w:lang w:eastAsia="zh-CN"/>
-        </w:rPr>
+      <w:r>
+        <w:rPr>
+          <w:rFonts w:ascii="inherit" w:hAnsi="inherit" w:cs="Arial"/>
+          <w:b w:val="0"/>
+          <w:color w:val="050505"/>
+          <w:sz w:val="23"/>
+          <w:szCs w:val="23"/>
+          <w:lang w:eastAsia="zh-CN"/>
+        </w:rPr>
+        <w:br/>
+        <w:t>Quang trung dõng xuất,</w:t>
+      </w:r>
+      <w:r>
+        <w:rPr>
+          <w:rFonts w:ascii="inherit" w:hAnsi="inherit" w:cs="Arial"/>
+          <w:b w:val="0"/>
+          <w:color w:val="050505"/>
+          <w:sz w:val="23"/>
+          <w:szCs w:val="23"/>
+          <w:lang w:eastAsia="zh-CN"/>
+        </w:rPr>
+        <w:br/>
         <w:t>Thiên diệp bảo liên,</w:t>
       </w:r>
-    </w:p>
-    <w:p>
-      <w:pPr>
-        <w:shd w:val="clear" w:color="auto" w:fill="FFFFFF"/>
-        <w:rPr>
-          <w:rFonts w:ascii="inherit" w:hAnsi="inherit" w:cs="Arial"/>
-          <w:b w:val="0"/>
-          <w:color w:val="050505"/>
-          <w:sz w:val="23"/>
-          <w:szCs w:val="23"/>
-          <w:lang w:eastAsia="zh-CN"/>
-        </w:rPr>
-      </w:pPr>
-      <w:r>
-        <w:rPr>
-          <w:rFonts w:ascii="inherit" w:hAnsi="inherit" w:cs="Arial"/>
-          <w:b w:val="0"/>
-          <w:color w:val="050505"/>
-          <w:sz w:val="23"/>
-          <w:szCs w:val="23"/>
-          <w:lang w:eastAsia="zh-CN"/>
-        </w:rPr>
+      <w:r>
+        <w:rPr>
+          <w:rFonts w:ascii="inherit" w:hAnsi="inherit" w:cs="Arial"/>
+          <w:b w:val="0"/>
+          <w:color w:val="050505"/>
+          <w:sz w:val="23"/>
+          <w:szCs w:val="23"/>
+          <w:lang w:eastAsia="zh-CN"/>
+        </w:rPr>
+        <w:br/>
         <w:t>Hữu hóa Như-Lai,</w:t>
       </w:r>
-    </w:p>
-    <w:p>
-      <w:pPr>
-        <w:shd w:val="clear" w:color="auto" w:fill="FFFFFF"/>
-        <w:rPr>
-          <w:rFonts w:ascii="inherit" w:hAnsi="inherit" w:cs="Arial"/>
-          <w:b w:val="0"/>
-          <w:color w:val="050505"/>
-          <w:sz w:val="23"/>
-          <w:szCs w:val="23"/>
-          <w:lang w:eastAsia="zh-CN"/>
-        </w:rPr>
-      </w:pPr>
-      <w:r>
-        <w:rPr>
-          <w:rFonts w:ascii="inherit" w:hAnsi="inherit" w:cs="Arial"/>
-          <w:b w:val="0"/>
-          <w:color w:val="050505"/>
-          <w:sz w:val="23"/>
-          <w:szCs w:val="23"/>
-          <w:lang w:eastAsia="zh-CN"/>
-        </w:rPr>
+      <w:r>
+        <w:rPr>
+          <w:rFonts w:ascii="inherit" w:hAnsi="inherit" w:cs="Arial"/>
+          <w:b w:val="0"/>
+          <w:color w:val="050505"/>
+          <w:sz w:val="23"/>
+          <w:szCs w:val="23"/>
+          <w:lang w:eastAsia="zh-CN"/>
+        </w:rPr>
+        <w:br/>
         <w:t>Tọa bảo hoa trung,</w:t>
       </w:r>
-    </w:p>
-    <w:p>
-      <w:pPr>
-        <w:shd w:val="clear" w:color="auto" w:fill="FFFFFF"/>
-        <w:rPr>
-          <w:rFonts w:ascii="inherit" w:hAnsi="inherit" w:cs="Arial"/>
-          <w:b w:val="0"/>
-          <w:color w:val="050505"/>
-          <w:sz w:val="23"/>
-          <w:szCs w:val="23"/>
-          <w:lang w:eastAsia="zh-CN"/>
-        </w:rPr>
-      </w:pPr>
-      <w:r>
-        <w:rPr>
-          <w:rFonts w:ascii="inherit" w:hAnsi="inherit" w:cs="Arial"/>
-          <w:b w:val="0"/>
-          <w:color w:val="050505"/>
-          <w:sz w:val="23"/>
-          <w:szCs w:val="23"/>
-          <w:lang w:eastAsia="zh-CN"/>
-        </w:rPr>
+      <w:r>
+        <w:rPr>
+          <w:rFonts w:ascii="inherit" w:hAnsi="inherit" w:cs="Arial"/>
+          <w:b w:val="0"/>
+          <w:color w:val="050505"/>
+          <w:sz w:val="23"/>
+          <w:szCs w:val="23"/>
+          <w:lang w:eastAsia="zh-CN"/>
+        </w:rPr>
+        <w:br/>
         <w:t>Đảnh phóng thập đạo,</w:t>
       </w:r>
-    </w:p>
-    <w:p>
-      <w:pPr>
-        <w:shd w:val="clear" w:color="auto" w:fill="FFFFFF"/>
-        <w:rPr>
-          <w:rFonts w:ascii="inherit" w:hAnsi="inherit" w:cs="Arial"/>
-          <w:b w:val="0"/>
-          <w:color w:val="050505"/>
-          <w:sz w:val="23"/>
-          <w:szCs w:val="23"/>
-          <w:lang w:eastAsia="zh-CN"/>
-        </w:rPr>
-      </w:pPr>
-      <w:r>
-        <w:rPr>
-          <w:rFonts w:ascii="inherit" w:hAnsi="inherit" w:cs="Arial"/>
-          <w:b w:val="0"/>
-          <w:color w:val="050505"/>
-          <w:sz w:val="23"/>
-          <w:szCs w:val="23"/>
-          <w:lang w:eastAsia="zh-CN"/>
-        </w:rPr>
+      <w:r>
+        <w:rPr>
+          <w:rFonts w:ascii="inherit" w:hAnsi="inherit" w:cs="Arial"/>
+          <w:b w:val="0"/>
+          <w:color w:val="050505"/>
+          <w:sz w:val="23"/>
+          <w:szCs w:val="23"/>
+          <w:lang w:eastAsia="zh-CN"/>
+        </w:rPr>
+        <w:br/>
         <w:t>Bá bảo quang-minh,</w:t>
       </w:r>
-    </w:p>
-    <w:p>
-      <w:pPr>
-        <w:shd w:val="clear" w:color="auto" w:fill="FFFFFF"/>
-        <w:rPr>
-          <w:rFonts w:ascii="inherit" w:hAnsi="inherit" w:cs="Arial"/>
-          <w:b w:val="0"/>
-          <w:color w:val="050505"/>
-          <w:sz w:val="23"/>
-          <w:szCs w:val="23"/>
-          <w:lang w:eastAsia="zh-CN"/>
-        </w:rPr>
-      </w:pPr>
-      <w:r>
-        <w:rPr>
-          <w:rFonts w:ascii="inherit" w:hAnsi="inherit" w:cs="Arial"/>
-          <w:b w:val="0"/>
-          <w:color w:val="050505"/>
-          <w:sz w:val="23"/>
-          <w:szCs w:val="23"/>
-          <w:lang w:eastAsia="zh-CN"/>
-        </w:rPr>
+      <w:r>
+        <w:rPr>
+          <w:rFonts w:ascii="inherit" w:hAnsi="inherit" w:cs="Arial"/>
+          <w:b w:val="0"/>
+          <w:color w:val="050505"/>
+          <w:sz w:val="23"/>
+          <w:szCs w:val="23"/>
+          <w:lang w:eastAsia="zh-CN"/>
+        </w:rPr>
+        <w:br/>
         <w:t>Nhứt nhứt quang-minh,</w:t>
       </w:r>
-    </w:p>
-    <w:p>
-      <w:pPr>
-        <w:shd w:val="clear" w:color="auto" w:fill="FFFFFF"/>
-        <w:rPr>
-          <w:rFonts w:ascii="inherit" w:hAnsi="inherit" w:cs="Arial"/>
-          <w:b w:val="0"/>
-          <w:color w:val="050505"/>
-          <w:sz w:val="23"/>
-          <w:szCs w:val="23"/>
-          <w:lang w:eastAsia="zh-CN"/>
-        </w:rPr>
-      </w:pPr>
-      <w:r>
-        <w:rPr>
-          <w:rFonts w:ascii="inherit" w:hAnsi="inherit" w:cs="Arial"/>
-          <w:b w:val="0"/>
-          <w:color w:val="050505"/>
-          <w:sz w:val="23"/>
-          <w:szCs w:val="23"/>
-          <w:lang w:eastAsia="zh-CN"/>
-        </w:rPr>
+      <w:r>
+        <w:rPr>
+          <w:rFonts w:ascii="inherit" w:hAnsi="inherit" w:cs="Arial"/>
+          <w:b w:val="0"/>
+          <w:color w:val="050505"/>
+          <w:sz w:val="23"/>
+          <w:szCs w:val="23"/>
+          <w:lang w:eastAsia="zh-CN"/>
+        </w:rPr>
+        <w:br/>
         <w:t>Giai biến thị hiện,</w:t>
       </w:r>
-    </w:p>
-    <w:p>
-      <w:pPr>
-        <w:shd w:val="clear" w:color="auto" w:fill="FFFFFF"/>
-        <w:rPr>
-          <w:rFonts w:ascii="inherit" w:hAnsi="inherit" w:cs="Arial"/>
-          <w:b w:val="0"/>
-          <w:color w:val="050505"/>
-          <w:sz w:val="23"/>
-          <w:szCs w:val="23"/>
-          <w:lang w:eastAsia="zh-CN"/>
-        </w:rPr>
-      </w:pPr>
-      <w:r>
-        <w:rPr>
-          <w:rFonts w:ascii="inherit" w:hAnsi="inherit" w:cs="Arial"/>
-          <w:b w:val="0"/>
-          <w:color w:val="050505"/>
-          <w:sz w:val="23"/>
-          <w:szCs w:val="23"/>
-          <w:lang w:eastAsia="zh-CN"/>
-        </w:rPr>
+      <w:r>
+        <w:rPr>
+          <w:rFonts w:ascii="inherit" w:hAnsi="inherit" w:cs="Arial"/>
+          <w:b w:val="0"/>
+          <w:color w:val="050505"/>
+          <w:sz w:val="23"/>
+          <w:szCs w:val="23"/>
+          <w:lang w:eastAsia="zh-CN"/>
+        </w:rPr>
+        <w:br/>
         <w:t>Thập hằng hà sa,</w:t>
       </w:r>
-    </w:p>
-    <w:p>
-      <w:pPr>
-        <w:shd w:val="clear" w:color="auto" w:fill="FFFFFF"/>
-        <w:rPr>
-          <w:rFonts w:ascii="inherit" w:hAnsi="inherit" w:cs="Arial"/>
-          <w:b w:val="0"/>
-          <w:color w:val="050505"/>
-          <w:sz w:val="23"/>
-          <w:szCs w:val="23"/>
-          <w:lang w:eastAsia="zh-CN"/>
-        </w:rPr>
-      </w:pPr>
-      <w:r>
-        <w:rPr>
-          <w:rFonts w:ascii="inherit" w:hAnsi="inherit" w:cs="Arial"/>
-          <w:b w:val="0"/>
-          <w:color w:val="050505"/>
-          <w:sz w:val="23"/>
-          <w:szCs w:val="23"/>
-          <w:lang w:eastAsia="zh-CN"/>
-        </w:rPr>
+      <w:r>
+        <w:rPr>
+          <w:rFonts w:ascii="inherit" w:hAnsi="inherit" w:cs="Arial"/>
+          <w:b w:val="0"/>
+          <w:color w:val="050505"/>
+          <w:sz w:val="23"/>
+          <w:szCs w:val="23"/>
+          <w:lang w:eastAsia="zh-CN"/>
+        </w:rPr>
+        <w:br/>
         <w:t>Kim-Cang mật tích,</w:t>
       </w:r>
-    </w:p>
-    <w:p>
-      <w:pPr>
-        <w:shd w:val="clear" w:color="auto" w:fill="FFFFFF"/>
-        <w:rPr>
-          <w:rFonts w:ascii="inherit" w:hAnsi="inherit" w:cs="Arial"/>
-          <w:b w:val="0"/>
-          <w:color w:val="050505"/>
-          <w:sz w:val="23"/>
-          <w:szCs w:val="23"/>
-          <w:lang w:eastAsia="zh-CN"/>
-        </w:rPr>
-      </w:pPr>
-      <w:r>
-        <w:rPr>
-          <w:rFonts w:ascii="inherit" w:hAnsi="inherit" w:cs="Arial"/>
-          <w:b w:val="0"/>
-          <w:color w:val="050505"/>
-          <w:sz w:val="23"/>
-          <w:szCs w:val="23"/>
-          <w:lang w:eastAsia="zh-CN"/>
-        </w:rPr>
+      <w:r>
+        <w:rPr>
+          <w:rFonts w:ascii="inherit" w:hAnsi="inherit" w:cs="Arial"/>
+          <w:b w:val="0"/>
+          <w:color w:val="050505"/>
+          <w:sz w:val="23"/>
+          <w:szCs w:val="23"/>
+          <w:lang w:eastAsia="zh-CN"/>
+        </w:rPr>
+        <w:br/>
         <w:t>Kình sơn trì sử,</w:t>
       </w:r>
-    </w:p>
-    <w:p>
-      <w:pPr>
-        <w:shd w:val="clear" w:color="auto" w:fill="FFFFFF"/>
-        <w:rPr>
-          <w:rFonts w:ascii="inherit" w:hAnsi="inherit" w:cs="Arial"/>
-          <w:b w:val="0"/>
-          <w:color w:val="050505"/>
-          <w:sz w:val="23"/>
-          <w:szCs w:val="23"/>
-          <w:lang w:eastAsia="zh-CN"/>
-        </w:rPr>
-      </w:pPr>
-      <w:r>
-        <w:rPr>
-          <w:rFonts w:ascii="inherit" w:hAnsi="inherit" w:cs="Arial"/>
-          <w:b w:val="0"/>
-          <w:color w:val="050505"/>
-          <w:sz w:val="23"/>
-          <w:szCs w:val="23"/>
-          <w:lang w:eastAsia="zh-CN"/>
-        </w:rPr>
+      <w:r>
+        <w:rPr>
+          <w:rFonts w:ascii="inherit" w:hAnsi="inherit" w:cs="Arial"/>
+          <w:b w:val="0"/>
+          <w:color w:val="050505"/>
+          <w:sz w:val="23"/>
+          <w:szCs w:val="23"/>
+          <w:lang w:eastAsia="zh-CN"/>
+        </w:rPr>
+        <w:br/>
         <w:t>Biến hư-không giới,</w:t>
       </w:r>
-    </w:p>
-    <w:p>
-      <w:pPr>
-        <w:shd w:val="clear" w:color="auto" w:fill="FFFFFF"/>
-        <w:rPr>
-          <w:rFonts w:ascii="inherit" w:hAnsi="inherit" w:cs="Arial"/>
-          <w:b w:val="0"/>
-          <w:color w:val="050505"/>
-          <w:sz w:val="23"/>
-          <w:szCs w:val="23"/>
-          <w:lang w:eastAsia="zh-CN"/>
-        </w:rPr>
-      </w:pPr>
-      <w:r>
-        <w:rPr>
-          <w:rFonts w:ascii="inherit" w:hAnsi="inherit" w:cs="Arial"/>
-          <w:b w:val="0"/>
-          <w:color w:val="050505"/>
-          <w:sz w:val="23"/>
-          <w:szCs w:val="23"/>
-          <w:lang w:eastAsia="zh-CN"/>
-        </w:rPr>
+      <w:r>
+        <w:rPr>
+          <w:rFonts w:ascii="inherit" w:hAnsi="inherit" w:cs="Arial"/>
+          <w:b w:val="0"/>
+          <w:color w:val="050505"/>
+          <w:sz w:val="23"/>
+          <w:szCs w:val="23"/>
+          <w:lang w:eastAsia="zh-CN"/>
+        </w:rPr>
+        <w:br/>
         <w:t>Đại chúng ngưỡng quan,</w:t>
       </w:r>
-    </w:p>
-    <w:p>
-      <w:pPr>
-        <w:shd w:val="clear" w:color="auto" w:fill="FFFFFF"/>
-        <w:rPr>
-          <w:rFonts w:ascii="inherit" w:hAnsi="inherit" w:cs="Arial"/>
-          <w:b w:val="0"/>
-          <w:color w:val="050505"/>
-          <w:sz w:val="23"/>
-          <w:szCs w:val="23"/>
-          <w:lang w:eastAsia="zh-CN"/>
-        </w:rPr>
-      </w:pPr>
-      <w:r>
-        <w:rPr>
-          <w:rFonts w:ascii="inherit" w:hAnsi="inherit" w:cs="Arial"/>
-          <w:b w:val="0"/>
-          <w:color w:val="050505"/>
-          <w:sz w:val="23"/>
-          <w:szCs w:val="23"/>
-          <w:lang w:eastAsia="zh-CN"/>
-        </w:rPr>
+      <w:r>
+        <w:rPr>
+          <w:rFonts w:ascii="inherit" w:hAnsi="inherit" w:cs="Arial"/>
+          <w:b w:val="0"/>
+          <w:color w:val="050505"/>
+          <w:sz w:val="23"/>
+          <w:szCs w:val="23"/>
+          <w:lang w:eastAsia="zh-CN"/>
+        </w:rPr>
+        <w:br/>
         <w:t>Ủy ái kiêm bảo,</w:t>
       </w:r>
-    </w:p>
-    <w:p>
-      <w:pPr>
-        <w:shd w:val="clear" w:color="auto" w:fill="FFFFFF"/>
-        <w:rPr>
-          <w:rFonts w:ascii="inherit" w:hAnsi="inherit" w:cs="Arial"/>
-          <w:b w:val="0"/>
-          <w:color w:val="050505"/>
-          <w:sz w:val="23"/>
-          <w:szCs w:val="23"/>
-          <w:lang w:eastAsia="zh-CN"/>
-        </w:rPr>
-      </w:pPr>
-      <w:r>
-        <w:rPr>
-          <w:rFonts w:ascii="inherit" w:hAnsi="inherit" w:cs="Arial"/>
-          <w:b w:val="0"/>
-          <w:color w:val="050505"/>
-          <w:sz w:val="23"/>
-          <w:szCs w:val="23"/>
-          <w:lang w:eastAsia="zh-CN"/>
-        </w:rPr>
+      <w:r>
+        <w:rPr>
+          <w:rFonts w:ascii="inherit" w:hAnsi="inherit" w:cs="Arial"/>
+          <w:b w:val="0"/>
+          <w:color w:val="050505"/>
+          <w:sz w:val="23"/>
+          <w:szCs w:val="23"/>
+          <w:lang w:eastAsia="zh-CN"/>
+        </w:rPr>
+        <w:br/>
         <w:t>Cầu Phật ai hựu,</w:t>
       </w:r>
-    </w:p>
-    <w:p>
-      <w:pPr>
-        <w:shd w:val="clear" w:color="auto" w:fill="FFFFFF"/>
-        <w:rPr>
-          <w:rFonts w:ascii="inherit" w:hAnsi="inherit" w:cs="Arial"/>
-          <w:b w:val="0"/>
-          <w:color w:val="050505"/>
-          <w:sz w:val="23"/>
-          <w:szCs w:val="23"/>
-          <w:lang w:eastAsia="zh-CN"/>
-        </w:rPr>
-      </w:pPr>
-      <w:r>
-        <w:rPr>
-          <w:rFonts w:ascii="inherit" w:hAnsi="inherit" w:cs="Arial"/>
-          <w:b w:val="0"/>
-          <w:color w:val="050505"/>
-          <w:sz w:val="23"/>
-          <w:szCs w:val="23"/>
-          <w:lang w:eastAsia="zh-CN"/>
-        </w:rPr>
+      <w:r>
+        <w:rPr>
+          <w:rFonts w:ascii="inherit" w:hAnsi="inherit" w:cs="Arial"/>
+          <w:b w:val="0"/>
+          <w:color w:val="050505"/>
+          <w:sz w:val="23"/>
+          <w:szCs w:val="23"/>
+          <w:lang w:eastAsia="zh-CN"/>
+        </w:rPr>
+        <w:br/>
         <w:t>Nhứt tâm thính Phật,</w:t>
       </w:r>
-    </w:p>
-    <w:p>
-      <w:pPr>
-        <w:shd w:val="clear" w:color="auto" w:fill="FFFFFF"/>
-        <w:rPr>
-          <w:rFonts w:ascii="inherit" w:hAnsi="inherit" w:cs="Arial"/>
-          <w:b w:val="0"/>
-          <w:color w:val="050505"/>
-          <w:sz w:val="23"/>
-          <w:szCs w:val="23"/>
-          <w:lang w:eastAsia="zh-CN"/>
-        </w:rPr>
-      </w:pPr>
-      <w:r>
-        <w:rPr>
-          <w:rFonts w:ascii="inherit" w:hAnsi="inherit" w:cs="Arial"/>
-          <w:b w:val="0"/>
-          <w:color w:val="050505"/>
-          <w:sz w:val="23"/>
-          <w:szCs w:val="23"/>
-          <w:lang w:eastAsia="zh-CN"/>
-        </w:rPr>
-        <w:t>Vô-kiến đảnh tướng ,</w:t>
-      </w:r>
-    </w:p>
-    <w:p>
-      <w:pPr>
-        <w:shd w:val="clear" w:color="auto" w:fill="FFFFFF"/>
-        <w:rPr>
-          <w:rFonts w:ascii="inherit" w:hAnsi="inherit" w:cs="Arial"/>
-          <w:b w:val="0"/>
-          <w:color w:val="050505"/>
-          <w:sz w:val="23"/>
-          <w:szCs w:val="23"/>
-          <w:lang w:eastAsia="zh-CN"/>
-        </w:rPr>
-      </w:pPr>
-      <w:r>
-        <w:rPr>
-          <w:rFonts w:ascii="inherit" w:hAnsi="inherit" w:cs="Arial"/>
-          <w:b w:val="0"/>
-          <w:color w:val="050505"/>
-          <w:sz w:val="23"/>
-          <w:szCs w:val="23"/>
-          <w:lang w:eastAsia="zh-CN"/>
-        </w:rPr>
+      <w:r>
+        <w:rPr>
+          <w:rFonts w:ascii="inherit" w:hAnsi="inherit" w:cs="Arial"/>
+          <w:b w:val="0"/>
+          <w:color w:val="050505"/>
+          <w:sz w:val="23"/>
+          <w:szCs w:val="23"/>
+          <w:lang w:eastAsia="zh-CN"/>
+        </w:rPr>
+        <w:br/>
+        <w:t>Vô-kiến đảnh tướng,</w:t>
+      </w:r>
+      <w:r>
+        <w:rPr>
+          <w:rFonts w:ascii="inherit" w:hAnsi="inherit" w:cs="Arial"/>
+          <w:b w:val="0"/>
+          <w:color w:val="050505"/>
+          <w:sz w:val="23"/>
+          <w:szCs w:val="23"/>
+          <w:lang w:eastAsia="zh-CN"/>
+        </w:rPr>
+        <w:br/>
         <w:t>Phóng quang như Lai,</w:t>
       </w:r>
-    </w:p>
-    <w:p>
-      <w:pPr>
-        <w:shd w:val="clear" w:color="auto" w:fill="FFFFFF"/>
-        <w:rPr>
-          <w:rFonts w:ascii="inherit" w:hAnsi="inherit" w:cs="Arial"/>
-          <w:b w:val="0"/>
-          <w:color w:val="050505"/>
-          <w:sz w:val="23"/>
-          <w:szCs w:val="23"/>
-          <w:lang w:eastAsia="zh-CN"/>
-        </w:rPr>
-      </w:pPr>
-      <w:r>
-        <w:rPr>
-          <w:rFonts w:ascii="inherit" w:hAnsi="inherit" w:cs="Arial"/>
-          <w:b w:val="0"/>
-          <w:color w:val="050505"/>
-          <w:sz w:val="23"/>
-          <w:szCs w:val="23"/>
-          <w:lang w:eastAsia="zh-CN"/>
-        </w:rPr>
+      <w:r>
+        <w:rPr>
+          <w:rFonts w:ascii="inherit" w:hAnsi="inherit" w:cs="Arial"/>
+          <w:b w:val="0"/>
+          <w:color w:val="050505"/>
+          <w:sz w:val="23"/>
+          <w:szCs w:val="23"/>
+          <w:lang w:eastAsia="zh-CN"/>
+        </w:rPr>
+        <w:br/>
         <w:t>Tuyên thuyết thần chú:</w:t>
       </w:r>
-    </w:p>
-    <w:p>
-      <w:pPr>
-        <w:pStyle w:val="Heading1"/>
-      </w:pPr>
     </w:p>
     <w:p>
       <w:pPr>
@@ -1371,7 +1656,29 @@
           <w:szCs w:val="23"/>
           <w:lang w:eastAsia="zh-CN"/>
         </w:rPr>
-        <w:t>05. tát đát tha</w:t>
+        <w:t xml:space="preserve">05. </w:t>
+      </w:r>
+      <w:r>
+        <w:rPr>
+          <w:rFonts w:ascii="inherit" w:hAnsi="inherit" w:cs="Arial"/>
+          <w:b w:val="0"/>
+          <w:color w:val="050505"/>
+          <w:sz w:val="23"/>
+          <w:szCs w:val="23"/>
+          <w:lang w:eastAsia="zh-CN"/>
+        </w:rPr>
+        <w:t>T</w:t>
+      </w:r>
+      <w:r>
+        <w:rPr>
+          <w:rFonts w:ascii="inherit" w:hAnsi="inherit" w:cs="Arial"/>
+          <w:b w:val="0"/>
+          <w:color w:val="050505"/>
+          <w:sz w:val="23"/>
+          <w:szCs w:val="23"/>
+          <w:lang w:eastAsia="zh-CN"/>
+        </w:rPr>
+        <w:t>át đát tha</w:t>
       </w:r>
     </w:p>
     <w:p>
@@ -1786,6 +2093,7 @@
           <w:szCs w:val="23"/>
           <w:lang w:eastAsia="zh-CN"/>
         </w:rPr>
+        <w:lastRenderedPageBreak/>
         <w:t>18. Nam-mô lô kê tam-miệu dà đa nẩm.</w:t>
       </w:r>
     </w:p>
@@ -2688,7 +2996,6 @@
           <w:szCs w:val="23"/>
           <w:lang w:val="de-DE" w:eastAsia="zh-CN"/>
         </w:rPr>
-        <w:lastRenderedPageBreak/>
         <w:t>47. Ma đát rị dà noa</w:t>
       </w:r>
     </w:p>
@@ -3399,6 +3706,7 @@
           <w:szCs w:val="23"/>
           <w:lang w:eastAsia="zh-CN"/>
         </w:rPr>
+        <w:lastRenderedPageBreak/>
         <w:t>68. A ra ha đế</w:t>
       </w:r>
     </w:p>
@@ -4301,7 +4609,6 @@
           <w:szCs w:val="23"/>
           <w:lang w:eastAsia="zh-CN"/>
         </w:rPr>
-        <w:lastRenderedPageBreak/>
         <w:fldChar w:fldCharType="begin"/>
       </w:r>
       <w:r>
@@ -5012,6 +5319,7 @@
           <w:szCs w:val="23"/>
           <w:lang w:eastAsia="zh-CN"/>
         </w:rPr>
+        <w:lastRenderedPageBreak/>
         <w:t>118. Thất đế nẩm</w:t>
       </w:r>
     </w:p>
@@ -5993,7 +6301,6 @@
           <w:szCs w:val="23"/>
           <w:lang w:val="de-DE" w:eastAsia="zh-CN"/>
         </w:rPr>
-        <w:lastRenderedPageBreak/>
         <w:t>146. Bạt xà ra ma lễ để</w:t>
       </w:r>
     </w:p>
@@ -6625,6 +6932,7 @@
           <w:szCs w:val="23"/>
           <w:lang w:val="de-DE" w:eastAsia="zh-CN"/>
         </w:rPr>
+        <w:lastRenderedPageBreak/>
         <w:t>168. Khuất tô mẫu</w:t>
       </w:r>
     </w:p>
@@ -7610,7 +7918,6 @@
           <w:szCs w:val="23"/>
           <w:lang w:eastAsia="zh-CN"/>
         </w:rPr>
-        <w:lastRenderedPageBreak/>
         <w:t>193. Hổ hồng đô lô ung</w:t>
       </w:r>
     </w:p>
@@ -8345,6 +8652,7 @@
           <w:szCs w:val="23"/>
           <w:lang w:eastAsia="zh-CN"/>
         </w:rPr>
+        <w:lastRenderedPageBreak/>
         <w:t>215. Tát đác tha</w:t>
       </w:r>
     </w:p>
@@ -9227,7 +9535,6 @@
           <w:szCs w:val="23"/>
           <w:lang w:eastAsia="zh-CN"/>
         </w:rPr>
-        <w:lastRenderedPageBreak/>
         <w:t>240. Ðột sắc xoa bà dạ</w:t>
       </w:r>
     </w:p>
@@ -9962,6 +10269,7 @@
           <w:szCs w:val="23"/>
           <w:lang w:val="de-DE" w:eastAsia="zh-CN"/>
         </w:rPr>
+        <w:lastRenderedPageBreak/>
         <w:t>262. Xa dạ yết ra ha</w:t>
       </w:r>
     </w:p>
@@ -10840,7 +11148,6 @@
           <w:szCs w:val="23"/>
           <w:lang w:val="de-DE" w:eastAsia="zh-CN"/>
         </w:rPr>
-        <w:lastRenderedPageBreak/>
         <w:t>290. Kê ra dạ di</w:t>
       </w:r>
     </w:p>
@@ -11575,6 +11882,7 @@
           <w:szCs w:val="23"/>
           <w:lang w:val="de-DE" w:eastAsia="zh-CN"/>
         </w:rPr>
+        <w:lastRenderedPageBreak/>
         <w:t>312. Kê ra dạ di</w:t>
       </w:r>
     </w:p>
@@ -12453,7 +12761,6 @@
           <w:szCs w:val="23"/>
           <w:lang w:val="de-DE" w:eastAsia="zh-CN"/>
         </w:rPr>
-        <w:lastRenderedPageBreak/>
         <w:t>340. Hất rị đởm</w:t>
       </w:r>
     </w:p>
@@ -13188,6 +13495,7 @@
           <w:szCs w:val="23"/>
           <w:lang w:eastAsia="zh-CN"/>
         </w:rPr>
+        <w:lastRenderedPageBreak/>
         <w:t>362. Bà dà phạm</w:t>
       </w:r>
     </w:p>
@@ -14070,7 +14378,6 @@
           <w:szCs w:val="23"/>
           <w:lang w:eastAsia="zh-CN"/>
         </w:rPr>
-        <w:lastRenderedPageBreak/>
         <w:t>387. Tát bà dược xoa tệ phấn</w:t>
       </w:r>
     </w:p>
@@ -14805,6 +15112,7 @@
           <w:szCs w:val="23"/>
           <w:lang w:val="de-DE" w:eastAsia="zh-CN"/>
         </w:rPr>
+        <w:lastRenderedPageBreak/>
         <w:t>409. Câu ma rị;</w:t>
       </w:r>
     </w:p>
@@ -15622,7 +15930,6 @@
         </w:rPr>
       </w:pPr>
       <w:r>
-        <w:lastRenderedPageBreak/>
         <w:fldChar w:fldCharType="begin"/>
       </w:r>
       <w:r>
@@ -16428,6 +16735,7 @@
           <w:szCs w:val="23"/>
           <w:lang w:eastAsia="zh-CN"/>
         </w:rPr>
+        <w:lastRenderedPageBreak/>
         <w:t>456. Bộ đa yết ra ha</w:t>
       </w:r>
     </w:p>
@@ -17282,7 +17590,6 @@
           <w:szCs w:val="23"/>
           <w:lang w:eastAsia="zh-CN"/>
         </w:rPr>
-        <w:lastRenderedPageBreak/>
         <w:fldChar w:fldCharType="begin"/>
       </w:r>
       <w:r>
@@ -18041,6 +18348,7 @@
           <w:szCs w:val="23"/>
           <w:lang w:val="de-DE" w:eastAsia="zh-CN"/>
         </w:rPr>
+        <w:lastRenderedPageBreak/>
         <w:t>506. Thập bà ra</w:t>
       </w:r>
     </w:p>
@@ -18974,7 +19282,6 @@
           <w:szCs w:val="23"/>
           <w:lang w:eastAsia="zh-CN"/>
         </w:rPr>
-        <w:lastRenderedPageBreak/>
         <w:t>532. Ma ha bạt xà lô</w:t>
       </w:r>
     </w:p>
@@ -20041,7 +20348,7 @@
     <w:link w:val="Heading1Char"/>
     <w:uiPriority w:val="9"/>
     <w:qFormat/>
-    <w:rsid w:val="000E4120"/>
+    <w:rsid w:val="000C5EE6"/>
     <w:pPr>
       <w:keepNext/>
       <w:keepLines/>
@@ -20050,14 +20357,13 @@
     </w:pPr>
     <w:rPr>
       <w:rFonts w:asciiTheme="majorHAnsi" w:eastAsiaTheme="majorEastAsia" w:hAnsiTheme="majorHAnsi" w:cstheme="majorBidi"/>
-      <w:color w:val="000000" w:themeColor="text1"/>
+      <w:color w:val="EE0000"/>
       <w:lang w:eastAsia="zh-CN"/>
     </w:rPr>
   </w:style>
   <w:style w:type="character" w:default="1" w:styleId="DefaultParagraphFont">
     <w:name w:val="Default Paragraph Font"/>
     <w:uiPriority w:val="1"/>
-    <w:semiHidden/>
     <w:unhideWhenUsed/>
   </w:style>
   <w:style w:type="table" w:default="1" w:styleId="TableNormal">
@@ -20143,11 +20449,11 @@
     <w:basedOn w:val="DefaultParagraphFont"/>
     <w:link w:val="Heading1"/>
     <w:uiPriority w:val="9"/>
-    <w:rsid w:val="000E4120"/>
+    <w:rsid w:val="000C5EE6"/>
     <w:rPr>
       <w:rFonts w:asciiTheme="majorHAnsi" w:eastAsiaTheme="majorEastAsia" w:hAnsiTheme="majorHAnsi" w:cstheme="majorBidi"/>
       <w:b/>
-      <w:color w:val="000000" w:themeColor="text1"/>
+      <w:color w:val="EE0000"/>
       <w:kern w:val="0"/>
       <w:sz w:val="28"/>
       <w:szCs w:val="28"/>

</xml_diff>